<commit_message>
Replace treinamento documents with reformatted versions
Co-Authored-By: Claude Sonnet 4.6 <noreply@anthropic.com>
Claude-Session: https://claude.ai/code/session_01LwAj8TGtgApfFwmLmGjHH9
</commit_message>
<xml_diff>
--- a/modelos/14_primeiros_socorros.docx
+++ b/modelos/14_primeiros_socorros.docx
@@ -398,11 +398,13 @@
                 <w:b/>
                 <w:bCs/>
               </w:rPr>
-            </w:r>
-            <w:r>
-              <w:rPr>
-                <w:rFonts w:ascii="Arial" w:hAnsi="Arial" w:cs="Arial"/>
-              </w:rPr>
+              <w:t xml:space="preserve">Nº CTPS:  </w:t>
+            </w:r>
+            <w:r>
+              <w:rPr>
+                <w:rFonts w:ascii="Arial" w:hAnsi="Arial" w:cs="Arial"/>
+              </w:rPr>
+              <w:t>@ctps</w:t>
             </w:r>
           </w:p>
         </w:tc>
@@ -433,11 +435,13 @@
                 <w:b/>
                 <w:bCs/>
               </w:rPr>
-            </w:r>
-            <w:r>
-              <w:rPr>
-                <w:rFonts w:ascii="Arial" w:hAnsi="Arial" w:cs="Arial"/>
-              </w:rPr>
+              <w:t>Nº RG</w:t>
+            </w:r>
+            <w:r>
+              <w:rPr>
+                <w:rFonts w:ascii="Arial" w:hAnsi="Arial" w:cs="Arial"/>
+              </w:rPr>
+              <w:t>: @rg</w:t>
             </w:r>
           </w:p>
         </w:tc>

</xml_diff>